<commit_message>
Add final Week 8 replication lab
</commit_message>
<xml_diff>
--- a/replication-lab-FILLED(1)(1) (1).docx
+++ b/replication-lab-FILLED(1)(1) (1).docx
@@ -5586,7 +5586,7 @@
         <w:t xml:space="preserve"> </w:t>
       </w:r>
       <w:r>
-        <w:t xml:space="preserve">[1] stats graphics grDevices utils datasets methods base</w:t>
+        <w:t xml:space="preserve">[1] stats graphics grDevices datasets utils methods base</w:t>
       </w:r>
     </w:p>
     <w:p>
@@ -5614,61 +5614,61 @@
         <w:t xml:space="preserve"> </w:t>
       </w:r>
       <w:r>
-        <w:t xml:space="preserve">[1] jsonlite_2.0.0 compiler_4.3.3 tidyselect_1.2.1 Rcpp_1.1.2</w:t>
-      </w:r>
-      <w:r>
-        <w:br/>
-      </w:r>
-      <w:r>
-        <w:t xml:space="preserve">[5] parallel_4.3.3 tidyr_1.3.2 globals_0.20.0 yaml_2.3.12</w:t>
-      </w:r>
-      <w:r>
-        <w:br/>
-      </w:r>
-      <w:r>
-        <w:t xml:space="preserve">[9] fastmap_1.2.0 readr_2.2.0 R6_2.6.1 generics_0.1.4</w:t>
-      </w:r>
-      <w:r>
-        <w:br/>
-      </w:r>
-      <w:r>
-        <w:t xml:space="preserve">[13] forcats_1.0.1 future_1.80.0 tibble_3.3.1 pROC_1.19.1</w:t>
-      </w:r>
-      <w:r>
-        <w:br/>
-      </w:r>
-      <w:r>
-        <w:t xml:space="preserve">[17] pillar_1.11.1 tzdb_0.5.0 rlang_1.3.0 xfun_0.62</w:t>
-      </w:r>
-      <w:r>
-        <w:br/>
-      </w:r>
-      <w:r>
-        <w:t xml:space="preserve">[21] cli_3.6.6 withr_3.0.3 magrittr_2.0.5 digest_0.6.39</w:t>
-      </w:r>
-      <w:r>
-        <w:br/>
-      </w:r>
-      <w:r>
-        <w:t xml:space="preserve">[25] hms_1.1.4 lifecycle_1.0.5 vctrs_0.7.3 evaluate_1.0.5</w:t>
-      </w:r>
-      <w:r>
-        <w:br/>
-      </w:r>
-      <w:r>
-        <w:t xml:space="preserve">[29] glue_1.8.1 listenv_1.1.0 furrr_0.4.0 codetools_0.2-19</w:t>
-      </w:r>
-      <w:r>
-        <w:t xml:space="preserve"> </w:t>
-      </w:r>
-      <w:r>
-        <w:t xml:space="preserve">[33] parallelly_1.48.0 rmarkdown_2.25 purrr_1.2.2 tools_4.3.3</w:t>
-      </w:r>
-      <w:r>
-        <w:br/>
-      </w:r>
-      <w:r>
-        <w:t xml:space="preserve">[37] pkgconfig_2.0.3 htmltools_0.5.9</w:t>
+        <w:t xml:space="preserve">[1] jsonlite_2.0.0 compiler_4.3.3 renv_1.0.3 Rcpp_1.1.2</w:t>
+      </w:r>
+      <w:r>
+        <w:br/>
+      </w:r>
+      <w:r>
+        <w:t xml:space="preserve">[5] tidyselect_1.2.1 parallel_4.3.3 tidyr_1.3.2 globals_0.20.0</w:t>
+      </w:r>
+      <w:r>
+        <w:br/>
+      </w:r>
+      <w:r>
+        <w:t xml:space="preserve">[9] yaml_2.3.12 fastmap_1.2.0 readr_2.2.0 R6_2.6.1</w:t>
+      </w:r>
+      <w:r>
+        <w:br/>
+      </w:r>
+      <w:r>
+        <w:t xml:space="preserve">[13] generics_0.1.4 forcats_1.0.1 future_1.80.0 tibble_3.3.1</w:t>
+      </w:r>
+      <w:r>
+        <w:br/>
+      </w:r>
+      <w:r>
+        <w:t xml:space="preserve">[17] pROC_1.19.1 pillar_1.11.1 tzdb_0.5.0 rlang_1.3.0</w:t>
+      </w:r>
+      <w:r>
+        <w:br/>
+      </w:r>
+      <w:r>
+        <w:t xml:space="preserve">[21] xfun_0.62 cli_3.6.6 withr_3.0.3 magrittr_2.0.5</w:t>
+      </w:r>
+      <w:r>
+        <w:br/>
+      </w:r>
+      <w:r>
+        <w:t xml:space="preserve">[25] digest_0.6.39 hms_1.1.4 lifecycle_1.0.5 vctrs_0.7.3</w:t>
+      </w:r>
+      <w:r>
+        <w:br/>
+      </w:r>
+      <w:r>
+        <w:t xml:space="preserve">[29] evaluate_1.0.5 glue_1.8.1 listenv_1.1.0 furrr_0.4.0</w:t>
+      </w:r>
+      <w:r>
+        <w:br/>
+      </w:r>
+      <w:r>
+        <w:t xml:space="preserve">[33] codetools_0.2-19 parallelly_1.48.0 rmarkdown_2.25 purrr_1.2.2</w:t>
+      </w:r>
+      <w:r>
+        <w:br/>
+      </w:r>
+      <w:r>
+        <w:t xml:space="preserve">[37] tools_4.3.3 pkgconfig_2.0.3 htmltools_0.5.9</w:t>
       </w:r>
     </w:p>
     <w:p>

</xml_diff>